<commit_message>
feat: implement stage app with multi-device orchestration and initial ecosystem UI components
</commit_message>
<xml_diff>
--- a/public/Penawaran_Ekosistem_Kopi_Jodi.docx
+++ b/public/Penawaran_Ekosistem_Kopi_Jodi.docx
@@ -81,7 +81,7 @@
                 <w:color w:val="D99B62"/>
                 <w:sz w:val="19"/>
               </w:rPr>
-              <w:t>PROPOSAL PENAWARAN TEKNOLOGI &amp; APLIKASI</w:t>
+              <w:t>REKOMENDASI SOLUSI TEKNOLOGI</w:t>
             </w:r>
           </w:p>
           <w:p>
@@ -96,7 +96,7 @@
                 <w:color w:val="FFFFFF"/>
                 <w:sz w:val="38"/>
               </w:rPr>
-              <w:t>EKOSISTEM DIGITAL KOPI JODI</w:t>
+              <w:t>EKOSISTEM DIGITAL KOPI SEDUHAN JODI</w:t>
             </w:r>
           </w:p>
           <w:p>
@@ -181,7 +181,7 @@
                 <w:rFonts w:ascii="Segoe UI" w:hAnsi="Segoe UI"/>
                 <w:sz w:val="17"/>
               </w:rPr>
-              <w:t>Founder &amp; Manajemen Kopi Jodi</w:t>
+              <w:t>Founder &amp; Manajemen Kopi Seduhan Jodi</w:t>
             </w:r>
           </w:p>
         </w:tc>
@@ -457,7 +457,7 @@
                 <w:color w:val="3E2723"/>
                 <w:sz w:val="20"/>
               </w:rPr>
-              <w:t>Solusi Ekosistem Kopi Jodi oleh genossys:</w:t>
+              <w:t>Solusi Ekosistem Kopi Seduhan Jodi oleh genossys:</w:t>
             </w:r>
           </w:p>
           <w:p>
@@ -1462,7 +1462,7 @@
               </w:rPr>
               <w:t>iOS &amp; Android</w:t>
               <w:br/>
-              <w:t>(Pelanggan Kopi Jodi)</w:t>
+              <w:t>(Pelanggan Kopi Seduhan Jodi)</w:t>
             </w:r>
           </w:p>
         </w:tc>
@@ -2181,7 +2181,7 @@
           <w:color w:val="374151"/>
           <w:sz w:val="19"/>
         </w:rPr>
-        <w:t>Kami menyediakan 2 alternatif skema yang dapat disesuaikan dengan kebutuhan dan strategi cashflow Kopi Jodi:</w:t>
+        <w:t>Kami menyediakan 2 alternatif skema yang dapat disesuaikan dengan kebutuhan dan strategi cashflow Kopi Seduhan Jodi:</w:t>
       </w:r>
     </w:p>
     <w:p>
@@ -3020,7 +3020,7 @@
                 <w:color w:val="374151"/>
                 <w:sz w:val="19"/>
               </w:rPr>
-              <w:t>• BEBAS TAMBAH FITUR APAPUN (Unlimited Custom Features): Kopi Jodi bebas meminta penambahan modul/fitur baru atau integrasi kustom kapan saja tanpa batasan dan tanpa biaya tambahan (Zero Change Request Fee).</w:t>
+              <w:t>• BEBAS TAMBAH FITUR APAPUN (Unlimited Custom Features): Kopi Seduhan Jodi bebas meminta penambahan modul/fitur baru atau integrasi kustom kapan saja tanpa batasan dan tanpa biaya tambahan (Zero Change Request Fee).</w:t>
             </w:r>
           </w:p>
           <w:p>
@@ -3072,7 +3072,7 @@
                 <w:color w:val="374151"/>
                 <w:sz w:val="19"/>
               </w:rPr>
-              <w:t>• Hak Milik: Seluruh source code yang dikembangkan menjadi milik Kopi Jodi.</w:t>
+              <w:t>• Hak Milik: Seluruh source code yang dikembangkan menjadi milik Kopi Seduhan Jodi.</w:t>
             </w:r>
           </w:p>
         </w:tc>
@@ -3285,7 +3285,7 @@
           </w:tcPr>
           <w:p>
             <w:r>
-              <w:t>Sangat Tepat jika Kopi Jodi memiliki modal awal &amp; ingin proyek selesai dalam target waktu.</w:t>
+              <w:t>Sangat Tepat jika Kopi Seduhan Jodi memiliki modal awal &amp; ingin proyek selesai dalam target waktu.</w:t>
             </w:r>
           </w:p>
         </w:tc>
@@ -3295,7 +3295,7 @@
           </w:tcPr>
           <w:p>
             <w:r>
-              <w:t>Sangat Tepat jika Kopi Jodi ingin inovasi bebas tanpa batas &amp; cashflow bulanan ringan.</w:t>
+              <w:t>Sangat Tepat jika Kopi Seduhan Jodi ingin inovasi bebas tanpa batas &amp; cashflow bulanan ringan.</w:t>
             </w:r>
           </w:p>
         </w:tc>
@@ -3316,7 +3316,7 @@
           <w:color w:val="2C1810"/>
           <w:sz w:val="28"/>
         </w:rPr>
-        <w:t>4. Komparasi Strategis: Mengapa Ekosistem Kopi Jodi Jauh Lebih Unggul &amp; Menguntungkan Dibanding Sewa Moka POS per Outlet?</w:t>
+        <w:t>4. Komparasi Strategis: Mengapa Ekosistem Kopi Seduhan Jodi Jauh Lebih Unggul &amp; Menguntungkan Dibanding Sewa Moka POS per Outlet?</w:t>
       </w:r>
     </w:p>
     <w:p>
@@ -3481,7 +3481,7 @@
                 <w:color w:val="FFFFFF"/>
                 <w:sz w:val="18"/>
               </w:rPr>
-              <w:t>Ekosistem Kopi Jodi (genossys)</w:t>
+              <w:t>Ekosistem Kopi Seduhan Jodi (genossys)</w:t>
             </w:r>
           </w:p>
         </w:tc>
@@ -4017,7 +4017,7 @@
                 <w:color w:val="374151"/>
                 <w:sz w:val="18"/>
               </w:rPr>
-              <w:t>KOPI JODI 50% LEBIH HEMAT (Hemat Rp 300 Juta!)</w:t>
+              <w:t>KOPI SEDUHAN JODI 50% LEBIH HEMAT (Hemat Rp 300 Juta!)</w:t>
             </w:r>
           </w:p>
         </w:tc>
@@ -4040,7 +4040,7 @@
           <w:color w:val="4A2E18"/>
           <w:sz w:val="23"/>
         </w:rPr>
-        <w:t>Perbandingan 10 Aspek Fundamental: Kopi Jodi vs Sewa Moka POS</w:t>
+        <w:t>Perbandingan 10 Aspek Fundamental: Kopi Seduhan Jodi vs Sewa Moka POS</w:t>
       </w:r>
     </w:p>
     <w:tbl>
@@ -4157,7 +4157,7 @@
                 <w:color w:val="FFFFFF"/>
                 <w:sz w:val="18"/>
               </w:rPr>
-              <w:t>Ekosistem Terintegrasi Kopi Jodi</w:t>
+              <w:t>Ekosistem Terintegrasi Kopi Seduhan Jodi</w:t>
             </w:r>
           </w:p>
         </w:tc>
@@ -4965,7 +4965,7 @@
                 <w:color w:val="374151"/>
                 <w:sz w:val="18"/>
               </w:rPr>
-              <w:t>100% Hak Milik Kopi Jodi: Source code dan database menjadi aset intelektual berharga perusahaan.</w:t>
+              <w:t>100% Hak Milik Kopi Seduhan Jodi: Source code dan database menjadi aset intelektual berharga perusahaan.</w:t>
             </w:r>
           </w:p>
         </w:tc>
@@ -5066,7 +5066,7 @@
                 <w:color w:val="374151"/>
                 <w:sz w:val="18"/>
               </w:rPr>
-              <w:t>Bebas 100% (Unlimited): Kopi Jodi bebas minta modul &amp; fitur baru apapun tanpa biaya tambahan.</w:t>
+              <w:t>Bebas 100% (Unlimited): Kopi Seduhan Jodi bebas minta modul &amp; fitur baru apapun tanpa biaya tambahan.</w:t>
             </w:r>
           </w:p>
         </w:tc>
@@ -5167,7 +5167,7 @@
                 <w:color w:val="374151"/>
                 <w:sz w:val="18"/>
               </w:rPr>
-              <w:t>Citra Korporasi Modern: 100% brand Kopi Jodi di seluruh perangkat (setara Fore / Kopi Kenangan).</w:t>
+              <w:t>Citra Korporasi Modern: 100% brand Kopi Seduhan Jodi di seluruh perangkat (setara Fore / Kopi Kenangan).</w:t>
             </w:r>
           </w:p>
         </w:tc>
@@ -6146,7 +6146,7 @@
           <w:color w:val="374151"/>
           <w:sz w:val="18"/>
         </w:rPr>
-        <w:t>Uji coba lapangan (UAT) di 1 pilot outlet Kopi Jodi.</w:t>
+        <w:t>Uji coba lapangan (UAT) di 1 pilot outlet Kopi Seduhan Jodi.</w:t>
       </w:r>
     </w:p>
     <w:p>
@@ -6273,7 +6273,7 @@
           <w:color w:val="374151"/>
           <w:sz w:val="19"/>
         </w:rPr>
-        <w:t>Silakan beri tanda centang pada opsi yang dipilih oleh Manajemen Kopi Jodi:</w:t>
+        <w:t>Silakan beri tanda centang pada opsi yang dipilih oleh Manajemen Kopi Seduhan Jodi:</w:t>
       </w:r>
     </w:p>
     <w:tbl>
@@ -6761,7 +6761,7 @@
                 <w:rFonts w:ascii="Segoe UI" w:hAnsi="Segoe UI"/>
                 <w:sz w:val="18"/>
               </w:rPr>
-              <w:t>Manajemen / Pemilik Bisnis Kopi Jodi</w:t>
+              <w:t>Manajemen / Pemilik Bisnis Kopi Seduhan Jodi</w:t>
             </w:r>
           </w:p>
         </w:tc>
@@ -7063,7 +7063,7 @@
         <w:color w:val="9CA3AF"/>
         <w:sz w:val="16"/>
       </w:rPr>
-      <w:t>Dipersiapkan oleh genossys (genossys2019@gmail.com) | Khusus Manajemen Kopi Jodi</w:t>
+      <w:t>Dipersiapkan oleh genossys (genossys2019@gmail.com) | Khusus Manajemen Kopi Seduhan Jodi</w:t>
     </w:r>
   </w:p>
 </w:ftr>
@@ -7082,7 +7082,7 @@
         <w:color w:val="9CA3AF"/>
         <w:sz w:val="16"/>
       </w:rPr>
-      <w:t>KOPI JODI x GENOSSYS | Proposal Ringkas Ekosistem Aplikasi Terpadu</w:t>
+      <w:t>KOPI SEDUHAN JODI x GENOSSYS | Rekomendasi Solusi Teknologi Ekosistem Aplikasi Terpadu</w:t>
     </w:r>
   </w:p>
 </w:hdr>

</xml_diff>